<commit_message>
Made the sizing work, and added some sizing-like options for Matrix.
</commit_message>
<xml_diff>
--- a/FDEM_2D_UserManual.docx
+++ b/FDEM_2D_UserManual.docx
@@ -2230,8 +2230,16 @@
         <w:rPr>
           <w:rFonts w:ascii="Consolas" w:eastAsia="Consolas" w:hAnsi="Consolas" w:cs="Consolas"/>
         </w:rPr>
-        <w:t>, %KETot</w:t>
-      </w:r>
+        <w:t>, %</w:t>
+      </w:r>
+      <w:proofErr w:type="spellStart"/>
+      <w:r>
+        <w:rPr>
+          <w:rFonts w:ascii="Consolas" w:eastAsia="Consolas" w:hAnsi="Consolas" w:cs="Consolas"/>
+        </w:rPr>
+        <w:t>KETot</w:t>
+      </w:r>
+      <w:proofErr w:type="spellEnd"/>
     </w:p>
     <w:p>
       <w:pPr>
@@ -5471,13 +5479,8 @@
       </w:r>
     </w:p>
     <w:p>
-      <w:proofErr w:type="gramStart"/>
-      <w:r>
-        <w:t>Not</w:t>
-      </w:r>
-      <w:proofErr w:type="gramEnd"/>
-      <w:r>
-        <w:t xml:space="preserve"> sure yet what this will be.  It is not </w:t>
+      <w:r>
+        <w:t xml:space="preserve">Not sure yet what this will be.  It is not </w:t>
       </w:r>
       <w:proofErr w:type="gramStart"/>
       <w:r>
@@ -7155,6 +7158,13 @@
         </w:rPr>
         <w:t>Sizing</w:t>
       </w:r>
+      <w:r>
+        <w:rPr>
+          <w:b/>
+          <w:color w:val="000000"/>
+        </w:rPr>
+        <w:t xml:space="preserve"> (old, ignore)</w:t>
+      </w:r>
     </w:p>
     <w:p>
       <w:pPr>
@@ -8549,6 +8559,242 @@
     </w:p>
     <w:p>
       <w:pPr>
+        <w:pStyle w:val="Heading2"/>
+      </w:pPr>
+      <w:r>
+        <w:t>*Sizing</w:t>
+      </w:r>
+    </w:p>
+    <w:p>
+      <w:r>
+        <w:t xml:space="preserve">Defines the equivalent-area truss/spring model used to connect non-contacting fiber pairs ("sizing" springs), including its elastic properties and modular failure criterion. Sizing springs use the same </w:t>
+      </w:r>
+      <w:proofErr w:type="spellStart"/>
+      <w:r>
+        <w:t>IFailureCriteria</w:t>
+      </w:r>
+      <w:proofErr w:type="spellEnd"/>
+      <w:r>
+        <w:t>/</w:t>
+      </w:r>
+      <w:proofErr w:type="spellStart"/>
+      <w:r>
+        <w:t>MaterialModel</w:t>
+      </w:r>
+      <w:proofErr w:type="spellEnd"/>
+      <w:r>
+        <w:t xml:space="preserve"> abstraction as *Matrix.</w:t>
+      </w:r>
+    </w:p>
+    <w:p>
+      <w:pPr>
+        <w:pStyle w:val="Heading3"/>
+      </w:pPr>
+      <w:proofErr w:type="spellStart"/>
+      <w:r>
+        <w:t>dMaxSiz</w:t>
+      </w:r>
+      <w:proofErr w:type="spellEnd"/>
+    </w:p>
+    <w:p>
+      <w:r>
+        <w:t>Maximum initial center-to-center distance between two fibers for a sizing spring to be created between them.</w:t>
+      </w:r>
+      <w:r>
+        <w:t xml:space="preserve">  In length scale</w:t>
+      </w:r>
+    </w:p>
+    <w:p>
+      <w:pPr>
+        <w:pStyle w:val="Heading3"/>
+      </w:pPr>
+      <w:proofErr w:type="spellStart"/>
+      <w:r>
+        <w:t>ESiz</w:t>
+      </w:r>
+      <w:proofErr w:type="spellEnd"/>
+    </w:p>
+    <w:p>
+      <w:r>
+        <w:t>Elastic (Young's) modulus of the equivalent sizing material.</w:t>
+      </w:r>
+    </w:p>
+    <w:p>
+      <w:pPr>
+        <w:pStyle w:val="Heading3"/>
+      </w:pPr>
+      <w:proofErr w:type="spellStart"/>
+      <w:r>
+        <w:t>NuSiz</w:t>
+      </w:r>
+      <w:proofErr w:type="spellEnd"/>
+    </w:p>
+    <w:p>
+      <w:r>
+        <w:lastRenderedPageBreak/>
+        <w:t>Poisson's ratio of the equivalent sizing material.</w:t>
+      </w:r>
+    </w:p>
+    <w:p>
+      <w:pPr>
+        <w:pStyle w:val="Heading3"/>
+      </w:pPr>
+      <w:proofErr w:type="spellStart"/>
+      <w:r>
+        <w:t>dSiz</w:t>
+      </w:r>
+      <w:proofErr w:type="spellEnd"/>
+    </w:p>
+    <w:p>
+      <w:r>
+        <w:t>Damping coefficient for the sizing spring (used to compute critical damping in the normal and tangential directions).</w:t>
+      </w:r>
+      <w:r>
+        <w:t xml:space="preserve">  1=critically damped</w:t>
+      </w:r>
+    </w:p>
+    <w:p>
+      <w:pPr>
+        <w:pStyle w:val="Heading3"/>
+      </w:pPr>
+      <w:proofErr w:type="spellStart"/>
+      <w:r>
+        <w:t>nAnalysSiz</w:t>
+      </w:r>
+      <w:proofErr w:type="spellEnd"/>
+    </w:p>
+    <w:p>
+      <w:r>
+        <w:t>Number of analysis steps to wait before evaluating/creating sizing springs.</w:t>
+      </w:r>
+    </w:p>
+    <w:p>
+      <w:pPr>
+        <w:pStyle w:val="Heading3"/>
+      </w:pPr>
+      <w:proofErr w:type="spellStart"/>
+      <w:r>
+        <w:t>probSiz</w:t>
+      </w:r>
+      <w:proofErr w:type="spellEnd"/>
+    </w:p>
+    <w:p>
+      <w:r>
+        <w:t>Probability (0–1) that a sizing spring is created between an eligible fiber pair.</w:t>
+      </w:r>
+    </w:p>
+    <w:p>
+      <w:pPr>
+        <w:pStyle w:val="Heading3"/>
+      </w:pPr>
+      <w:proofErr w:type="spellStart"/>
+      <w:r>
+        <w:t>failureCriteriaNameSiz</w:t>
+      </w:r>
+      <w:proofErr w:type="spellEnd"/>
+    </w:p>
+    <w:p>
+      <w:r>
+        <w:t xml:space="preserve">Name of the failure criterion used to evaluate spring failure. Must match one of the criteria supported by </w:t>
+      </w:r>
+      <w:proofErr w:type="spellStart"/>
+      <w:r>
+        <w:t>CreateFailureCriteria</w:t>
+      </w:r>
+      <w:proofErr w:type="spellEnd"/>
+      <w:r>
+        <w:t xml:space="preserve"> (e.g. VonMises, </w:t>
+      </w:r>
+      <w:proofErr w:type="spellStart"/>
+      <w:r>
+        <w:t>MaxPrincipalStress</w:t>
+      </w:r>
+      <w:proofErr w:type="spellEnd"/>
+      <w:r>
+        <w:t xml:space="preserve">, </w:t>
+      </w:r>
+      <w:proofErr w:type="spellStart"/>
+      <w:r>
+        <w:t>MaxPrincipalStrain</w:t>
+      </w:r>
+      <w:proofErr w:type="spellEnd"/>
+      <w:r>
+        <w:t xml:space="preserve">, </w:t>
+      </w:r>
+      <w:proofErr w:type="spellStart"/>
+      <w:r>
+        <w:t>FractureEnergyPrincipalStress</w:t>
+      </w:r>
+      <w:proofErr w:type="spellEnd"/>
+      <w:r>
+        <w:t xml:space="preserve">, </w:t>
+      </w:r>
+      <w:proofErr w:type="spellStart"/>
+      <w:r>
+        <w:t>MaxPrincStressWithDamage</w:t>
+      </w:r>
+      <w:proofErr w:type="spellEnd"/>
+      <w:r>
+        <w:t xml:space="preserve">, MaxPrincStressWithDamage2, </w:t>
+      </w:r>
+      <w:proofErr w:type="spellStart"/>
+      <w:r>
+        <w:t>MaxPrincStrainWithDamage</w:t>
+      </w:r>
+      <w:proofErr w:type="spellEnd"/>
+      <w:r>
+        <w:t xml:space="preserve">, </w:t>
+      </w:r>
+      <w:proofErr w:type="spellStart"/>
+      <w:r>
+        <w:t>MaxPrincStressZIntDNoDamage</w:t>
+      </w:r>
+      <w:proofErr w:type="spellEnd"/>
+      <w:r>
+        <w:t xml:space="preserve">, </w:t>
+      </w:r>
+      <w:proofErr w:type="spellStart"/>
+      <w:r>
+        <w:t>NoFailure</w:t>
+      </w:r>
+      <w:proofErr w:type="spellEnd"/>
+      <w:r>
+        <w:t>). Failure is currently brittle: once the criterion is met, the spring breaks completely (progressive damage is not yet implemented for sizing).</w:t>
+      </w:r>
+    </w:p>
+    <w:p>
+      <w:pPr>
+        <w:pStyle w:val="Heading3"/>
+      </w:pPr>
+      <w:proofErr w:type="spellStart"/>
+      <w:r>
+        <w:t>failureConstantsSiz</w:t>
+      </w:r>
+      <w:proofErr w:type="spellEnd"/>
+    </w:p>
+    <w:p>
+      <w:r>
+        <w:t xml:space="preserve">Slash-separated (/) list of numeric constants required by the chosen </w:t>
+      </w:r>
+      <w:proofErr w:type="spellStart"/>
+      <w:r>
+        <w:t>failureCriteriaNameSiz</w:t>
+      </w:r>
+      <w:proofErr w:type="spellEnd"/>
+      <w:r>
+        <w:t xml:space="preserve"> (e.g. a single critical stress value for VonMises). Leave blank when using </w:t>
+      </w:r>
+      <w:proofErr w:type="spellStart"/>
+      <w:r>
+        <w:t>NoFailure</w:t>
+      </w:r>
+      <w:proofErr w:type="spellEnd"/>
+      <w:r>
+        <w:t>.</w:t>
+      </w:r>
+    </w:p>
+    <w:p>
+      <w:pPr>
         <w:pStyle w:val="Heading3"/>
       </w:pPr>
       <w:r>
@@ -8867,21 +9113,7 @@
         <w:rPr>
           <w:color w:val="000000"/>
         </w:rPr>
-        <w:t xml:space="preserve">: name of all the objects that could be concluded.  Use names defined earlier.  Other than object names, </w:t>
-      </w:r>
-      <w:proofErr w:type="gramStart"/>
-      <w:r>
-        <w:rPr>
-          <w:color w:val="000000"/>
-        </w:rPr>
-        <w:t>could</w:t>
-      </w:r>
-      <w:proofErr w:type="gramEnd"/>
-      <w:r>
-        <w:rPr>
-          <w:color w:val="000000"/>
-        </w:rPr>
-        <w:t xml:space="preserve"> include Contact,  </w:t>
+        <w:t xml:space="preserve">: name of all the objects that could be concluded.  Use names defined earlier.  Other than object names, could include Contact,  </w:t>
       </w:r>
     </w:p>
     <w:p>
@@ -9095,15 +9327,7 @@
     </w:p>
     <w:p>
       <w:r>
-        <w:t xml:space="preserve">Each class should be divided up into private properties, public, </w:t>
-      </w:r>
-      <w:proofErr w:type="gramStart"/>
-      <w:r>
-        <w:t>constructors</w:t>
-      </w:r>
-      <w:proofErr w:type="gramEnd"/>
-      <w:r>
-        <w:t>, private methods, and public methods in this template:</w:t>
+        <w:t>Each class should be divided up into private properties, public, constructors, private methods, and public methods in this template:</w:t>
       </w:r>
     </w:p>
     <w:p>

</xml_diff>